<commit_message>
Security Scanner: correct IntelX free-tier credit figure (50, not ~500)
The '~500 credits/day' was a wrong code comment. Verified live via IntelX
/authenticate/info: /intelligent/search has CreditMax=50 (Credit=48 after test
scans), CreditReset present (recurring). So the free tier is ~50 search credits
per cycle, max 3 concurrent — usable only for a handful of ad-hoc scans, far too
small for cohort/sustained volume. Updated the checker comment + OUTSTANDING.md
(reinforces the need for a paid replacement; avoid burning credits on smoke tests).

Co-Authored-By: Claude Opus 4.7 <noreply@anthropic.com>
</commit_message>
<xml_diff>
--- a/security_scanner/docs/OUTSTANDING.docx
+++ b/security_scanner/docs/OUTSTANDING.docx
@@ -1770,58 +1770,127 @@
     </w:p>
     <w:p>
       <w:r>
-        <w:t xml:space="preserve">note was stale). The </w:t>
+        <w:t>note was stale). **Correction (2026-05-31, verified live via</w:t>
+      </w:r>
+    </w:p>
+    <w:p>
+      <w:r>
+        <w:rPr>
+          <w:rFonts w:ascii="Consolas" w:hAnsi="Consolas"/>
+          <w:sz w:val="18"/>
+        </w:rPr>
+        <w:t>/authenticate/info</w:t>
+      </w:r>
+      <w:r>
+        <w:t>):</w:t>
       </w:r>
       <w:r>
         <w:rPr>
           <w:b/>
         </w:rPr>
-        <w:t>free tier refreshes ~500 query credits/day</w:t>
+        <w:t xml:space="preserve"> the free tier's search cap is </w:t>
       </w:r>
       <w:r>
-        <w:t xml:space="preserve"> (40</w:t>
+        <w:rPr>
+          <w:rFonts w:ascii="Consolas" w:hAnsi="Consolas"/>
+          <w:sz w:val="18"/>
+        </w:rPr>
+        <w:t>CreditMax = 50</w:t>
+      </w:r>
+      <w:r>
+        <w:t>** for</w:t>
       </w:r>
     </w:p>
     <w:p>
       <w:r>
-        <w:t xml:space="preserve">results/search) — i.e. it is </w:t>
+        <w:rPr>
+          <w:rFonts w:ascii="Consolas" w:hAnsi="Consolas"/>
+          <w:sz w:val="18"/>
+        </w:rPr>
+        <w:t>/intelligent/search</w:t>
+      </w:r>
+      <w:r>
+        <w:t xml:space="preserve"> (NOT ~500 — that was a wrong code comment). </w:t>
+      </w:r>
+      <w:r>
+        <w:rPr>
+          <w:rFonts w:ascii="Consolas" w:hAnsi="Consolas"/>
+          <w:sz w:val="18"/>
+        </w:rPr>
+        <w:t>CreditReset</w:t>
+      </w:r>
+    </w:p>
+    <w:p>
+      <w:r>
+        <w:t xml:space="preserve">is present so credits </w:t>
       </w:r>
       <w:r>
         <w:rPr>
           <w:b/>
         </w:rPr>
-        <w:t>recurring/daily</w:t>
+        <w:t>do replenish</w:t>
       </w:r>
       <w:r>
-        <w:t>, not a one-off trial. So it</w:t>
+        <w:t xml:space="preserve"> (recurring, not one-off), but the cap is</w:t>
       </w:r>
     </w:p>
     <w:p>
       <w:r>
-        <w:t xml:space="preserve">is usable now for </w:t>
+        <w:t xml:space="preserve">only </w:t>
       </w:r>
       <w:r>
         <w:rPr>
           <w:b/>
         </w:rPr>
-        <w:t>low-volume / ad-hoc broker scans</w:t>
+        <w:t>~50 search credits per cycle</w:t>
       </w:r>
       <w:r>
-        <w:t>, but the 40-results cap</w:t>
+        <w:t xml:space="preserve"> (1 credit/scan), and max 3 concurrent</w:t>
       </w:r>
     </w:p>
     <w:p>
       <w:r>
-        <w:t xml:space="preserve">and daily ceiling make it </w:t>
+        <w:t xml:space="preserve">searches. So it is usable only for a </w:t>
       </w:r>
       <w:r>
         <w:rPr>
           <w:b/>
         </w:rPr>
-        <w:t>insufficient for the 4,000-client cohort</w:t>
+        <w:t>handful of ad-hoc scans per cycle</w:t>
       </w:r>
       <w:r>
-        <w:t>.</w:t>
+        <w:t xml:space="preserve"> —</w:t>
+      </w:r>
+    </w:p>
+    <w:p>
+      <w:r>
+        <w:rPr>
+          <w:b/>
+        </w:rPr>
+        <w:t>far too small for the 4,000-client cohort or sustained broker volume.</w:t>
+      </w:r>
+      <w:r>
+        <w:t xml:space="preserve"> A</w:t>
+      </w:r>
+    </w:p>
+    <w:p>
+      <w:r>
+        <w:t>sustainable paid replacement is therefore the real requirement. Avoid burning</w:t>
+      </w:r>
+    </w:p>
+    <w:p>
+      <w:r>
+        <w:t>credits on test scans (</w:t>
+      </w:r>
+      <w:r>
+        <w:rPr>
+          <w:rFonts w:ascii="Consolas" w:hAnsi="Consolas"/>
+          <w:sz w:val="18"/>
+        </w:rPr>
+        <w:t>skip_intelx:true</w:t>
+      </w:r>
+      <w:r>
+        <w:t xml:space="preserve"> for smoke tests).</w:t>
       </w:r>
     </w:p>
     <w:p>

</xml_diff>